<commit_message>
Doku und Backups restrukturiert; Glossar konsolidiert und Material aktualisiert
</commit_message>
<xml_diff>
--- a/Lernhandbuch/Teil1_Intro_Kap1-3.docx
+++ b/Lernhandbuch/Teil1_Intro_Kap1-3.docx
@@ -14934,6 +14934,13 @@
   <w:style w:type="paragraph" w:default="1" w:styleId="Standard">
     <w:name w:val="Normal"/>
     <w:qFormat/>
+    <w:pPr>
+      <w:spacing w:line="360" w:lineRule="auto"/>
+    </w:pPr>
+    <w:rPr>
+      <w:rFonts w:ascii="Times New Roman" w:hAnsi="Times New Roman"/>
+      <w:sz w:val="24"/>
+    </w:rPr>
   </w:style>
   <w:style w:type="paragraph" w:styleId="berschrift1">
     <w:name w:val="heading 1"/>
@@ -14944,10 +14951,12 @@
       <w:outlineLvl w:val="0"/>
     </w:pPr>
     <w:rPr>
+      <w:rFonts w:ascii="Times New Roman" w:hAnsi="Times New Roman"/>
       <w:b/>
       <w:bCs/>
-      <w:color w:val="1F3864"/>
-      <w:sz w:val="36"/>
+      <w:i w:val="0"/>
+      <w:color w:val="000000"/>
+      <w:sz w:val="28"/>
       <w:szCs w:val="36"/>
     </w:rPr>
   </w:style>
@@ -14961,10 +14970,12 @@
       <w:outlineLvl w:val="1"/>
     </w:pPr>
     <w:rPr>
+      <w:rFonts w:ascii="Times New Roman" w:hAnsi="Times New Roman"/>
       <w:b/>
       <w:bCs/>
-      <w:color w:val="2E74B5"/>
-      <w:sz w:val="28"/>
+      <w:i w:val="0"/>
+      <w:color w:val="000000"/>
+      <w:sz w:val="24"/>
       <w:szCs w:val="28"/>
     </w:rPr>
   </w:style>
@@ -14978,9 +14989,11 @@
       <w:outlineLvl w:val="2"/>
     </w:pPr>
     <w:rPr>
+      <w:rFonts w:ascii="Times New Roman" w:hAnsi="Times New Roman"/>
       <w:b/>
       <w:bCs/>
-      <w:color w:val="2E74B5"/>
+      <w:i/>
+      <w:color w:val="000000"/>
       <w:sz w:val="24"/>
       <w:szCs w:val="24"/>
     </w:rPr>
@@ -14995,9 +15008,12 @@
       <w:outlineLvl w:val="3"/>
     </w:pPr>
     <w:rPr>
+      <w:rFonts w:ascii="Times New Roman" w:hAnsi="Times New Roman"/>
+      <w:b/>
       <w:i/>
       <w:iCs/>
-      <w:color w:val="2E74B5"/>
+      <w:color w:val="000000"/>
+      <w:sz w:val="24"/>
     </w:rPr>
   </w:style>
   <w:style w:type="paragraph" w:styleId="berschrift5">
@@ -15010,7 +15026,11 @@
       <w:outlineLvl w:val="4"/>
     </w:pPr>
     <w:rPr>
-      <w:color w:val="2E74B5"/>
+      <w:rFonts w:ascii="Times New Roman" w:hAnsi="Times New Roman"/>
+      <w:b/>
+      <w:i/>
+      <w:color w:val="000000"/>
+      <w:sz w:val="24"/>
     </w:rPr>
   </w:style>
   <w:style w:type="paragraph" w:styleId="berschrift6">
@@ -15023,7 +15043,11 @@
       <w:outlineLvl w:val="5"/>
     </w:pPr>
     <w:rPr>
-      <w:color w:val="1F4D78"/>
+      <w:rFonts w:ascii="Times New Roman" w:hAnsi="Times New Roman"/>
+      <w:b/>
+      <w:i/>
+      <w:color w:val="000000"/>
+      <w:sz w:val="24"/>
     </w:rPr>
   </w:style>
   <w:style w:type="character" w:default="1" w:styleId="Absatz-Standardschriftart">
@@ -15058,7 +15082,11 @@
     <w:uiPriority w:val="10"/>
     <w:qFormat/>
     <w:rPr>
-      <w:sz w:val="56"/>
+      <w:rFonts w:ascii="Times New Roman" w:hAnsi="Times New Roman"/>
+      <w:b/>
+      <w:i w:val="0"/>
+      <w:color w:val="000000"/>
+      <w:sz w:val="40"/>
       <w:szCs w:val="56"/>
     </w:rPr>
   </w:style>

</xml_diff>